<commit_message>
Se corrije un pequeño detalle del documento
</commit_message>
<xml_diff>
--- a/Documento Tecnico.docx
+++ b/Documento Tecnico.docx
@@ -14,23 +14,7 @@
           <w:sz w:val="40"/>
           <w:szCs w:val="40"/>
         </w:rPr>
-        <w:t xml:space="preserve">Documento </w:t>
-      </w:r>
-      <w:proofErr w:type="spellStart"/>
-      <w:r>
-        <w:rPr>
-          <w:sz w:val="40"/>
-          <w:szCs w:val="40"/>
-        </w:rPr>
-        <w:t>Tecnico</w:t>
-      </w:r>
-      <w:proofErr w:type="spellEnd"/>
-      <w:r>
-        <w:rPr>
-          <w:sz w:val="40"/>
-          <w:szCs w:val="40"/>
-        </w:rPr>
-        <w:t>: Diseño general de la arquitectura del Pipeline ETL</w:t>
+        <w:t>Documento Tecnico: Diseño general de la arquitectura del Pipeline ETL</w:t>
       </w:r>
     </w:p>
     <w:p/>
@@ -46,101 +30,66 @@
           <w:szCs w:val="28"/>
         </w:rPr>
       </w:pPr>
-      <w:proofErr w:type="spellStart"/>
       <w:r>
         <w:rPr>
           <w:sz w:val="28"/>
           <w:szCs w:val="28"/>
         </w:rPr>
-        <w:t>Descripcion</w:t>
-      </w:r>
-      <w:proofErr w:type="spellEnd"/>
+        <w:t>Descripcion general de la solución</w:t>
+      </w:r>
+    </w:p>
+    <w:p>
+      <w:pPr>
+        <w:ind w:left="360"/>
+      </w:pPr>
+      <w:r>
+        <w:t xml:space="preserve">A continuación se detalla la arquitectura de la solución desarrollada para una compañía de alquiler de viviendas en Nueva York. El objetivo es integrar </w:t>
+      </w:r>
+      <w:r>
+        <w:t>múltiples</w:t>
+      </w:r>
+      <w:r>
+        <w:t xml:space="preserve"> fuentes de datos de precios y alquileres junto con la cotización diaria del dólar. El sistema permite analizar la evolución de los precios de alquiler en relación al valor del dólar según el peso argentino.</w:t>
+      </w:r>
+    </w:p>
+    <w:p>
+      <w:pPr>
+        <w:ind w:left="360"/>
+      </w:pPr>
+      <w:r>
+        <w:t>La arquitectura esta orquestada por Apache Airflo</w:t>
+      </w:r>
+      <w:r>
+        <w:t>w</w:t>
+      </w:r>
+      <w:r>
+        <w:t xml:space="preserve"> corriendo en un contenedor Docker desplegado localmente. Incluye almacenamiento en AWS S3, procesamiento en Python, y persistencia en MySQL alojado en AWS RDS. Se implemento flujo CI/CD con GiHub Actions.</w:t>
+      </w:r>
+    </w:p>
+    <w:p>
+      <w:pPr>
+        <w:ind w:left="360"/>
+      </w:pPr>
+      <w:r>
+        <w:t>Se pensó en una arquitectura que permite el flujo de datos de forma eficiente, escalable, integrable, y completamente automatizada. Se utilizan test de validación en dbt para garantizar integridad y calidad del dato.</w:t>
+      </w:r>
+    </w:p>
+    <w:p>
+      <w:pPr>
+        <w:ind w:left="360"/>
+      </w:pPr>
+      <w:r>
+        <w:t>Arquitectura de la solución:</w:t>
+      </w:r>
+    </w:p>
+    <w:p>
+      <w:pPr>
+        <w:ind w:left="360"/>
+      </w:pPr>
       <w:r>
         <w:rPr>
-          <w:sz w:val="28"/>
-          <w:szCs w:val="28"/>
+          <w:noProof/>
         </w:rPr>
-        <w:t xml:space="preserve"> general de la solución</w:t>
-      </w:r>
-    </w:p>
-    <w:p>
-      <w:pPr>
-        <w:ind w:left="360"/>
-      </w:pPr>
-      <w:r>
-        <w:t xml:space="preserve">A </w:t>
-      </w:r>
-      <w:proofErr w:type="gramStart"/>
-      <w:r>
-        <w:t>continuación</w:t>
-      </w:r>
-      <w:proofErr w:type="gramEnd"/>
-      <w:r>
-        <w:t xml:space="preserve"> se detalla la arquitectura de la solución desarrollada para una compañía de alquiler de viviendas en Nueva York. El objetivo es integrar </w:t>
-      </w:r>
-      <w:r>
-        <w:t>múltiples</w:t>
-      </w:r>
-      <w:r>
-        <w:t xml:space="preserve"> fuentes de datos de precios y alquileres junto con la cotización diaria del dólar. El sistema permite analizar la evolución de los precios de alquiler en relación al valor del dólar según el peso argentino.</w:t>
-      </w:r>
-    </w:p>
-    <w:p>
-      <w:pPr>
-        <w:ind w:left="360"/>
-      </w:pPr>
-      <w:r>
-        <w:t xml:space="preserve">La arquitectura esta orquestada por Apache </w:t>
-      </w:r>
-      <w:proofErr w:type="spellStart"/>
-      <w:r>
-        <w:t>Airflo</w:t>
-      </w:r>
-      <w:r>
-        <w:t>w</w:t>
-      </w:r>
-      <w:proofErr w:type="spellEnd"/>
-      <w:r>
-        <w:t xml:space="preserve"> corriendo en un contenedor Docker desplegado localmente. Incluye almacenamiento en AWS S3, procesamiento en Python, y persistencia en MySQL alojado en AWS RDS. Se implemento flujo CI/CD con GiHub </w:t>
-      </w:r>
-      <w:proofErr w:type="spellStart"/>
-      <w:r>
-        <w:t>Actions</w:t>
-      </w:r>
-      <w:proofErr w:type="spellEnd"/>
-      <w:r>
-        <w:t>.</w:t>
-      </w:r>
-    </w:p>
-    <w:p>
-      <w:pPr>
-        <w:ind w:left="360"/>
-      </w:pPr>
-      <w:r>
-        <w:t xml:space="preserve">Se pensó en una arquitectura que permite el flujo de datos de forma eficiente, escalable, integrable, y completamente automatizada. Se utilizan test de validación en </w:t>
-      </w:r>
-      <w:proofErr w:type="spellStart"/>
-      <w:r>
-        <w:t>dbt</w:t>
-      </w:r>
-      <w:proofErr w:type="spellEnd"/>
-      <w:r>
-        <w:t xml:space="preserve"> para garantizar integridad y calidad del dato.</w:t>
-      </w:r>
-    </w:p>
-    <w:p>
-      <w:pPr>
-        <w:ind w:left="360"/>
-      </w:pPr>
-      <w:r>
-        <w:t>Arquitectura de la solución:</w:t>
-      </w:r>
-    </w:p>
-    <w:p>
-      <w:pPr>
-        <w:ind w:left="360"/>
-      </w:pPr>
-      <w:r>
         <w:drawing>
           <wp:inline distT="0" distB="0" distL="0" distR="0" wp14:anchorId="66A473AA" wp14:editId="6343F0BA">
             <wp:extent cx="4946498" cy="3382395"/>
@@ -200,17 +149,8 @@
           <w:sz w:val="28"/>
           <w:szCs w:val="28"/>
         </w:rPr>
-        <w:t xml:space="preserve">Capas del Data </w:t>
-      </w:r>
-      <w:proofErr w:type="spellStart"/>
-      <w:r>
-        <w:rPr>
-          <w:sz w:val="28"/>
-          <w:szCs w:val="28"/>
-        </w:rPr>
-        <w:t>Warehouse</w:t>
-      </w:r>
-      <w:proofErr w:type="spellEnd"/>
+        <w:t>Capas del Data Warehouse</w:t>
+      </w:r>
     </w:p>
     <w:p>
       <w:pPr>
@@ -327,15 +267,7 @@
         </w:numPr>
       </w:pPr>
       <w:r>
-        <w:t xml:space="preserve">Es la primera etapa del pipeline orquestado por </w:t>
-      </w:r>
-      <w:proofErr w:type="spellStart"/>
-      <w:r>
-        <w:t>Airflow</w:t>
-      </w:r>
-      <w:proofErr w:type="spellEnd"/>
-      <w:r>
-        <w:t>.</w:t>
+        <w:t>Es la primera etapa del pipeline orquestado por Airflow.</w:t>
       </w:r>
     </w:p>
     <w:p>
@@ -407,13 +339,8 @@
         </w:numPr>
       </w:pPr>
       <w:r>
-        <w:t xml:space="preserve">Tablas de </w:t>
-      </w:r>
-      <w:proofErr w:type="spellStart"/>
-      <w:r>
-        <w:t>staging</w:t>
-      </w:r>
-      <w:proofErr w:type="spellEnd"/>
+        <w:t>Tablas de staging</w:t>
+      </w:r>
     </w:p>
     <w:p>
       <w:pPr>
@@ -424,15 +351,7 @@
         </w:numPr>
       </w:pPr>
       <w:r>
-        <w:t>Tablas particionadas por fecha de ingesta (</w:t>
-      </w:r>
-      <w:proofErr w:type="spellStart"/>
-      <w:r>
-        <w:t>ingestion_date</w:t>
-      </w:r>
-      <w:proofErr w:type="spellEnd"/>
-      <w:r>
-        <w:t>)</w:t>
+        <w:t>Tablas particionadas por fecha de ingesta (ingestion_date)</w:t>
       </w:r>
     </w:p>
     <w:p>
@@ -456,13 +375,8 @@
         </w:numPr>
       </w:pPr>
       <w:r>
-        <w:t xml:space="preserve">Datos extraídos de </w:t>
-      </w:r>
-      <w:proofErr w:type="spellStart"/>
-      <w:r>
-        <w:t>APIs</w:t>
-      </w:r>
-      <w:proofErr w:type="spellEnd"/>
+        <w:t>Datos extraídos de APIs</w:t>
+      </w:r>
     </w:p>
     <w:p>
       <w:pPr>
@@ -472,13 +386,8 @@
           <w:numId w:val="3"/>
         </w:numPr>
       </w:pPr>
-      <w:proofErr w:type="spellStart"/>
-      <w:r>
-        <w:t>Dumps</w:t>
-      </w:r>
-      <w:proofErr w:type="spellEnd"/>
-      <w:r>
-        <w:t xml:space="preserve"> de bases transaccionales</w:t>
+      <w:r>
+        <w:t>Dumps de bases transaccionales</w:t>
       </w:r>
     </w:p>
     <w:p>
@@ -490,15 +399,7 @@
         </w:numPr>
       </w:pPr>
       <w:r>
-        <w:t xml:space="preserve">Archivos cargados desde </w:t>
-      </w:r>
-      <w:proofErr w:type="spellStart"/>
-      <w:r>
-        <w:t>buckets</w:t>
-      </w:r>
-      <w:proofErr w:type="spellEnd"/>
-      <w:r>
-        <w:t xml:space="preserve"> (S3)</w:t>
+        <w:t>Archivos cargados desde buckets (S3)</w:t>
       </w:r>
     </w:p>
     <w:p>
@@ -526,21 +427,19 @@
         </w:rPr>
         <w:t>Capa Silver (</w:t>
       </w:r>
-      <w:proofErr w:type="spellStart"/>
       <w:r>
         <w:rPr>
           <w:b/>
           <w:bCs/>
         </w:rPr>
-        <w:t>Cleansed</w:t>
-      </w:r>
-      <w:proofErr w:type="spellEnd"/>
+        <w:t>Staging</w:t>
+      </w:r>
       <w:r>
         <w:rPr>
           <w:b/>
           <w:bCs/>
         </w:rPr>
-        <w:t xml:space="preserve"> / Transformación)</w:t>
+        <w:t>)</w:t>
       </w:r>
     </w:p>
     <w:p>
@@ -604,15 +503,7 @@
         </w:numPr>
       </w:pPr>
       <w:r>
-        <w:t>Validaciones de calidad (</w:t>
-      </w:r>
-      <w:proofErr w:type="spellStart"/>
-      <w:r>
-        <w:t>nulls</w:t>
-      </w:r>
-      <w:proofErr w:type="spellEnd"/>
-      <w:r>
-        <w:t>, rangos, formatos).</w:t>
+        <w:t>Validaciones de calidad (nulls, rangos, formatos).</w:t>
       </w:r>
     </w:p>
     <w:p>
@@ -744,15 +635,7 @@
         </w:numPr>
       </w:pPr>
       <w:r>
-        <w:t xml:space="preserve">Usuarios con </w:t>
-      </w:r>
-      <w:proofErr w:type="spellStart"/>
-      <w:r>
-        <w:t>IDs</w:t>
-      </w:r>
-      <w:proofErr w:type="spellEnd"/>
-      <w:r>
-        <w:t xml:space="preserve"> únicos y campos estandarizados</w:t>
+        <w:t>Usuarios con IDs únicos y campos estandarizados</w:t>
       </w:r>
     </w:p>
     <w:p>
@@ -797,21 +680,19 @@
         </w:rPr>
         <w:t>Capa Gold (</w:t>
       </w:r>
-      <w:proofErr w:type="spellStart"/>
       <w:r>
         <w:rPr>
           <w:b/>
           <w:bCs/>
         </w:rPr>
-        <w:t>Analytics</w:t>
-      </w:r>
-      <w:proofErr w:type="spellEnd"/>
+        <w:t>Core</w:t>
+      </w:r>
       <w:r>
         <w:rPr>
           <w:b/>
           <w:bCs/>
         </w:rPr>
-        <w:t xml:space="preserve"> / Consumo)</w:t>
+        <w:t>)</w:t>
       </w:r>
     </w:p>
     <w:p>
@@ -827,15 +708,7 @@
       </w:r>
       <w:r>
         <w:br/>
-        <w:t xml:space="preserve">Proveer datos listos para análisis, </w:t>
-      </w:r>
-      <w:proofErr w:type="spellStart"/>
-      <w:r>
-        <w:t>reporting</w:t>
-      </w:r>
-      <w:proofErr w:type="spellEnd"/>
-      <w:r>
-        <w:t xml:space="preserve"> y consumo por usuarios finales o aplicaciones.</w:t>
+        <w:t>Proveer datos listos para análisis, reporting y consumo por usuarios finales o aplicaciones.</w:t>
       </w:r>
     </w:p>
     <w:p>
@@ -896,23 +769,7 @@
       </w:pPr>
       <w:r>
         <w:lastRenderedPageBreak/>
-        <w:t xml:space="preserve">Fuente directa para </w:t>
-      </w:r>
-      <w:proofErr w:type="spellStart"/>
-      <w:r>
-        <w:t>dashboards</w:t>
-      </w:r>
-      <w:proofErr w:type="spellEnd"/>
-      <w:r>
-        <w:t xml:space="preserve"> y </w:t>
-      </w:r>
-      <w:proofErr w:type="spellStart"/>
-      <w:r>
-        <w:t>KPIs</w:t>
-      </w:r>
-      <w:proofErr w:type="spellEnd"/>
-      <w:r>
-        <w:t>.</w:t>
+        <w:t>Fuente directa para dashboards y KPIs.</w:t>
       </w:r>
     </w:p>
     <w:p>
@@ -1008,15 +865,7 @@
         </w:numPr>
       </w:pPr>
       <w:r>
-        <w:t xml:space="preserve">Data </w:t>
-      </w:r>
-      <w:proofErr w:type="spellStart"/>
-      <w:r>
-        <w:t>marts</w:t>
-      </w:r>
-      <w:proofErr w:type="spellEnd"/>
-      <w:r>
-        <w:t xml:space="preserve"> por dominio</w:t>
+        <w:t>Data marts por dominio</w:t>
       </w:r>
     </w:p>
     <w:p>
@@ -1039,13 +888,8 @@
           <w:numId w:val="7"/>
         </w:numPr>
       </w:pPr>
-      <w:proofErr w:type="spellStart"/>
-      <w:r>
-        <w:t>KPIs</w:t>
-      </w:r>
-      <w:proofErr w:type="spellEnd"/>
-      <w:r>
-        <w:t xml:space="preserve"> diarios/mensuales</w:t>
+      <w:r>
+        <w:t>KPIs diarios/mensuales</w:t>
       </w:r>
     </w:p>
     <w:p>
@@ -1069,15 +913,7 @@
         </w:numPr>
       </w:pPr>
       <w:r>
-        <w:t xml:space="preserve">Vistas consumidas por herramientas BI (Power BI, </w:t>
-      </w:r>
-      <w:proofErr w:type="spellStart"/>
-      <w:r>
-        <w:t>Tableau</w:t>
-      </w:r>
-      <w:proofErr w:type="spellEnd"/>
-      <w:r>
-        <w:t>, Looker)</w:t>
+        <w:t>Vistas consumidas por herramientas BI (Power BI, Tableau, Looker)</w:t>
       </w:r>
     </w:p>
     <w:p>
@@ -1102,37 +938,12 @@
           <w:szCs w:val="28"/>
         </w:rPr>
       </w:pPr>
-      <w:proofErr w:type="spellStart"/>
       <w:r>
         <w:rPr>
           <w:sz w:val="28"/>
           <w:szCs w:val="28"/>
         </w:rPr>
-        <w:t>Justificacion</w:t>
-      </w:r>
-      <w:proofErr w:type="spellEnd"/>
-      <w:r>
-        <w:rPr>
-          <w:sz w:val="28"/>
-          <w:szCs w:val="28"/>
-        </w:rPr>
-        <w:t xml:space="preserve"> de </w:t>
-      </w:r>
-      <w:proofErr w:type="spellStart"/>
-      <w:r>
-        <w:rPr>
-          <w:sz w:val="28"/>
-          <w:szCs w:val="28"/>
-        </w:rPr>
-        <w:t>Tecnologias</w:t>
-      </w:r>
-      <w:proofErr w:type="spellEnd"/>
-      <w:r>
-        <w:rPr>
-          <w:sz w:val="28"/>
-          <w:szCs w:val="28"/>
-        </w:rPr>
-        <w:t xml:space="preserve"> empleadas</w:t>
+        <w:t>Justificacion de Tecnologias empleadas</w:t>
       </w:r>
     </w:p>
     <w:tbl>
@@ -1312,29 +1123,7 @@
                 <w:lang w:eastAsia="es-AR"/>
                 <w14:ligatures w14:val="none"/>
               </w:rPr>
-              <w:t xml:space="preserve"> Lenguaje principal del pipeline por su versatilidad, amplia adopción en ingeniería de datos y compatibilidad con librerías de ETL, </w:t>
-            </w:r>
-            <w:proofErr w:type="spellStart"/>
-            <w:r>
-              <w:rPr>
-                <w:rFonts w:ascii="Calibri" w:eastAsia="Times New Roman" w:hAnsi="Calibri" w:cs="Calibri"/>
-                <w:color w:val="000000"/>
-                <w:kern w:val="0"/>
-                <w:lang w:eastAsia="es-AR"/>
-                <w14:ligatures w14:val="none"/>
-              </w:rPr>
-              <w:t>APIs</w:t>
-            </w:r>
-            <w:proofErr w:type="spellEnd"/>
-            <w:r>
-              <w:rPr>
-                <w:rFonts w:ascii="Calibri" w:eastAsia="Times New Roman" w:hAnsi="Calibri" w:cs="Calibri"/>
-                <w:color w:val="000000"/>
-                <w:kern w:val="0"/>
-                <w:lang w:eastAsia="es-AR"/>
-                <w14:ligatures w14:val="none"/>
-              </w:rPr>
-              <w:t xml:space="preserve"> y automatización.</w:t>
+              <w:t xml:space="preserve"> Lenguaje principal del pipeline por su versatilidad, amplia adopción en ingeniería de datos y compatibilidad con librerías de ETL, APIs y automatización.</w:t>
             </w:r>
           </w:p>
         </w:tc>
@@ -1376,29 +1165,7 @@
                 <w:lang w:eastAsia="es-AR"/>
                 <w14:ligatures w14:val="none"/>
               </w:rPr>
-              <w:t xml:space="preserve">Apache </w:t>
-            </w:r>
-            <w:proofErr w:type="spellStart"/>
-            <w:r>
-              <w:rPr>
-                <w:rFonts w:ascii="Calibri" w:eastAsia="Times New Roman" w:hAnsi="Calibri" w:cs="Calibri"/>
-                <w:color w:val="000000"/>
-                <w:kern w:val="0"/>
-                <w:lang w:eastAsia="es-AR"/>
-                <w14:ligatures w14:val="none"/>
-              </w:rPr>
-              <w:t>Airflow</w:t>
-            </w:r>
-            <w:proofErr w:type="spellEnd"/>
-            <w:r>
-              <w:rPr>
-                <w:rFonts w:ascii="Calibri" w:eastAsia="Times New Roman" w:hAnsi="Calibri" w:cs="Calibri"/>
-                <w:color w:val="000000"/>
-                <w:kern w:val="0"/>
-                <w:lang w:eastAsia="es-AR"/>
-                <w14:ligatures w14:val="none"/>
-              </w:rPr>
-              <w:t xml:space="preserve"> </w:t>
+              <w:t xml:space="preserve">Apache Airflow </w:t>
             </w:r>
           </w:p>
         </w:tc>
@@ -1593,51 +1360,7 @@
                 <w:lang w:eastAsia="es-AR"/>
                 <w14:ligatures w14:val="none"/>
               </w:rPr>
-              <w:t xml:space="preserve"> Almacenamiento escalable y económico para la capa Bronze y Silver </w:t>
-            </w:r>
-            <w:proofErr w:type="gramStart"/>
-            <w:r>
-              <w:rPr>
-                <w:rFonts w:ascii="Calibri" w:eastAsia="Times New Roman" w:hAnsi="Calibri" w:cs="Calibri"/>
-                <w:color w:val="000000"/>
-                <w:kern w:val="0"/>
-                <w:lang w:eastAsia="es-AR"/>
-                <w14:ligatures w14:val="none"/>
-              </w:rPr>
-              <w:t>del data</w:t>
-            </w:r>
-            <w:proofErr w:type="gramEnd"/>
-            <w:r>
-              <w:rPr>
-                <w:rFonts w:ascii="Calibri" w:eastAsia="Times New Roman" w:hAnsi="Calibri" w:cs="Calibri"/>
-                <w:color w:val="000000"/>
-                <w:kern w:val="0"/>
-                <w:lang w:eastAsia="es-AR"/>
-                <w14:ligatures w14:val="none"/>
-              </w:rPr>
-              <w:t xml:space="preserve"> </w:t>
-            </w:r>
-            <w:proofErr w:type="spellStart"/>
-            <w:r>
-              <w:rPr>
-                <w:rFonts w:ascii="Calibri" w:eastAsia="Times New Roman" w:hAnsi="Calibri" w:cs="Calibri"/>
-                <w:color w:val="000000"/>
-                <w:kern w:val="0"/>
-                <w:lang w:eastAsia="es-AR"/>
-                <w14:ligatures w14:val="none"/>
-              </w:rPr>
-              <w:t>lake</w:t>
-            </w:r>
-            <w:proofErr w:type="spellEnd"/>
-            <w:r>
-              <w:rPr>
-                <w:rFonts w:ascii="Calibri" w:eastAsia="Times New Roman" w:hAnsi="Calibri" w:cs="Calibri"/>
-                <w:color w:val="000000"/>
-                <w:kern w:val="0"/>
-                <w:lang w:eastAsia="es-AR"/>
-                <w14:ligatures w14:val="none"/>
-              </w:rPr>
-              <w:t>, ideal para manejar grandes volúmenes de datos.</w:t>
+              <w:t xml:space="preserve"> Almacenamiento escalable y económico para la capa Bronze y Silver del data lake, ideal para manejar grandes volúmenes de datos.</w:t>
             </w:r>
           </w:p>
         </w:tc>
@@ -1837,29 +1560,7 @@
                 <w:lang w:eastAsia="es-AR"/>
                 <w14:ligatures w14:val="none"/>
               </w:rPr>
-              <w:t xml:space="preserve">GitHub </w:t>
-            </w:r>
-            <w:proofErr w:type="spellStart"/>
-            <w:r>
-              <w:rPr>
-                <w:rFonts w:ascii="Calibri" w:eastAsia="Times New Roman" w:hAnsi="Calibri" w:cs="Calibri"/>
-                <w:color w:val="000000"/>
-                <w:kern w:val="0"/>
-                <w:lang w:eastAsia="es-AR"/>
-                <w14:ligatures w14:val="none"/>
-              </w:rPr>
-              <w:t>Actions</w:t>
-            </w:r>
-            <w:proofErr w:type="spellEnd"/>
-            <w:r>
-              <w:rPr>
-                <w:rFonts w:ascii="Calibri" w:eastAsia="Times New Roman" w:hAnsi="Calibri" w:cs="Calibri"/>
-                <w:color w:val="000000"/>
-                <w:kern w:val="0"/>
-                <w:lang w:eastAsia="es-AR"/>
-                <w14:ligatures w14:val="none"/>
-              </w:rPr>
-              <w:t xml:space="preserve"> </w:t>
+              <w:t xml:space="preserve">GitHub Actions </w:t>
             </w:r>
           </w:p>
         </w:tc>
@@ -1896,29 +1597,7 @@
                 <w:lang w:eastAsia="es-AR"/>
                 <w14:ligatures w14:val="none"/>
               </w:rPr>
-              <w:t xml:space="preserve"> Automatiza procesos de CI/CD como </w:t>
-            </w:r>
-            <w:proofErr w:type="spellStart"/>
-            <w:r>
-              <w:rPr>
-                <w:rFonts w:ascii="Calibri" w:eastAsia="Times New Roman" w:hAnsi="Calibri" w:cs="Calibri"/>
-                <w:color w:val="000000"/>
-                <w:kern w:val="0"/>
-                <w:lang w:eastAsia="es-AR"/>
-                <w14:ligatures w14:val="none"/>
-              </w:rPr>
-              <w:t>testing</w:t>
-            </w:r>
-            <w:proofErr w:type="spellEnd"/>
-            <w:r>
-              <w:rPr>
-                <w:rFonts w:ascii="Calibri" w:eastAsia="Times New Roman" w:hAnsi="Calibri" w:cs="Calibri"/>
-                <w:color w:val="000000"/>
-                <w:kern w:val="0"/>
-                <w:lang w:eastAsia="es-AR"/>
-                <w14:ligatures w14:val="none"/>
-              </w:rPr>
-              <w:t>, validación y despliegue del pipeline de datos.</w:t>
+              <w:t xml:space="preserve"> Automatiza procesos de CI/CD como testing, validación y despliegue del pipeline de datos.</w:t>
             </w:r>
           </w:p>
         </w:tc>
@@ -1952,7 +1631,6 @@
                 <w14:ligatures w14:val="none"/>
               </w:rPr>
             </w:pPr>
-            <w:proofErr w:type="spellStart"/>
             <w:r>
               <w:rPr>
                 <w:rFonts w:ascii="Calibri" w:eastAsia="Times New Roman" w:hAnsi="Calibri" w:cs="Calibri"/>
@@ -1961,18 +1639,7 @@
                 <w:lang w:eastAsia="es-AR"/>
                 <w14:ligatures w14:val="none"/>
               </w:rPr>
-              <w:t>Jupyter</w:t>
-            </w:r>
-            <w:proofErr w:type="spellEnd"/>
-            <w:r>
-              <w:rPr>
-                <w:rFonts w:ascii="Calibri" w:eastAsia="Times New Roman" w:hAnsi="Calibri" w:cs="Calibri"/>
-                <w:color w:val="000000"/>
-                <w:kern w:val="0"/>
-                <w:lang w:eastAsia="es-AR"/>
-                <w14:ligatures w14:val="none"/>
-              </w:rPr>
-              <w:t xml:space="preserve"> Notebook </w:t>
+              <w:t xml:space="preserve">Jupyter Notebook </w:t>
             </w:r>
           </w:p>
         </w:tc>
@@ -2043,7 +1710,6 @@
                 <w14:ligatures w14:val="none"/>
               </w:rPr>
             </w:pPr>
-            <w:proofErr w:type="spellStart"/>
             <w:r>
               <w:rPr>
                 <w:rFonts w:ascii="Calibri" w:eastAsia="Times New Roman" w:hAnsi="Calibri" w:cs="Calibri"/>
@@ -2052,18 +1718,7 @@
                 <w:lang w:eastAsia="es-AR"/>
                 <w14:ligatures w14:val="none"/>
               </w:rPr>
-              <w:t>dbt</w:t>
-            </w:r>
-            <w:proofErr w:type="spellEnd"/>
-            <w:r>
-              <w:rPr>
-                <w:rFonts w:ascii="Calibri" w:eastAsia="Times New Roman" w:hAnsi="Calibri" w:cs="Calibri"/>
-                <w:color w:val="000000"/>
-                <w:kern w:val="0"/>
-                <w:lang w:eastAsia="es-AR"/>
-                <w14:ligatures w14:val="none"/>
-              </w:rPr>
-              <w:t xml:space="preserve"> </w:t>
+              <w:t xml:space="preserve">dbt </w:t>
             </w:r>
           </w:p>
         </w:tc>
@@ -2138,21 +1793,8 @@
         <w:pStyle w:val="Prrafodelista"/>
       </w:pPr>
       <w:r>
-        <w:t xml:space="preserve">API BCRA – </w:t>
-      </w:r>
-      <w:proofErr w:type="spellStart"/>
-      <w:r>
-        <w:t>Cotizacion</w:t>
-      </w:r>
-      <w:proofErr w:type="spellEnd"/>
-      <w:r>
-        <w:t xml:space="preserve"> </w:t>
-      </w:r>
-      <w:proofErr w:type="gramStart"/>
-      <w:r>
-        <w:t>Dólar</w:t>
-      </w:r>
-      <w:proofErr w:type="gramEnd"/>
+        <w:t>API BCRA – Cotizacion Dólar</w:t>
+      </w:r>
     </w:p>
     <w:p>
       <w:pPr>
@@ -2163,21 +1805,8 @@
         </w:numPr>
       </w:pPr>
       <w:r>
-        <w:t xml:space="preserve">Relevancia: </w:t>
-      </w:r>
-      <w:proofErr w:type="spellStart"/>
-      <w:r>
-        <w:t>Informacion</w:t>
-      </w:r>
-      <w:proofErr w:type="spellEnd"/>
-      <w:r>
-        <w:t xml:space="preserve"> de cotización del </w:t>
-      </w:r>
-      <w:proofErr w:type="spellStart"/>
-      <w:r>
-        <w:t>dia</w:t>
-      </w:r>
-      <w:proofErr w:type="spellEnd"/>
+        <w:t>Relevancia: Informacion de cotización del dia</w:t>
+      </w:r>
     </w:p>
     <w:p>
       <w:pPr>
@@ -2277,13 +1906,8 @@
           <w:numId w:val="11"/>
         </w:numPr>
       </w:pPr>
-      <w:proofErr w:type="spellStart"/>
-      <w:r>
-        <w:t>Extraccion</w:t>
-      </w:r>
-      <w:proofErr w:type="spellEnd"/>
-      <w:r>
-        <w:t>:</w:t>
+      <w:r>
+        <w:t>Extraccion:</w:t>
       </w:r>
     </w:p>
     <w:p>
@@ -2319,10 +1943,7 @@
         </w:numPr>
       </w:pPr>
       <w:r>
-        <w:t>Carga</w:t>
-      </w:r>
-      <w:r>
-        <w:t>:</w:t>
+        <w:t>Carga:</w:t>
       </w:r>
     </w:p>
     <w:p>
@@ -2345,13 +1966,8 @@
           <w:numId w:val="11"/>
         </w:numPr>
       </w:pPr>
-      <w:proofErr w:type="spellStart"/>
-      <w:r>
-        <w:t>Transformacion</w:t>
-      </w:r>
-      <w:proofErr w:type="spellEnd"/>
-      <w:r>
-        <w:t>:</w:t>
+      <w:r>
+        <w:t>Transformacion:</w:t>
       </w:r>
     </w:p>
     <w:p>
@@ -2363,15 +1979,7 @@
         </w:numPr>
       </w:pPr>
       <w:r>
-        <w:t xml:space="preserve">Se utilizan </w:t>
-      </w:r>
-      <w:proofErr w:type="gramStart"/>
-      <w:r>
-        <w:t>los script</w:t>
-      </w:r>
-      <w:proofErr w:type="gramEnd"/>
-      <w:r>
-        <w:t xml:space="preserve"> de Python para procesar la carga y transformación</w:t>
+        <w:t>Se utilizan los script de Python para procesar la carga y transformación</w:t>
       </w:r>
     </w:p>
     <w:p>
@@ -2394,13 +2002,8 @@
           <w:numId w:val="11"/>
         </w:numPr>
       </w:pPr>
-      <w:proofErr w:type="spellStart"/>
-      <w:r>
-        <w:t>Agregacion</w:t>
-      </w:r>
-      <w:proofErr w:type="spellEnd"/>
-      <w:r>
-        <w:t>:</w:t>
+      <w:r>
+        <w:t>Agregacion:</w:t>
       </w:r>
     </w:p>
     <w:p>
@@ -2424,10 +2027,7 @@
         </w:numPr>
       </w:pPr>
       <w:r>
-        <w:t>Consumo</w:t>
-      </w:r>
-      <w:r>
-        <w:t>:</w:t>
+        <w:t>Consumo:</w:t>
       </w:r>
     </w:p>
     <w:p>
@@ -2438,21 +2038,8 @@
           <w:numId w:val="11"/>
         </w:numPr>
       </w:pPr>
-      <w:proofErr w:type="spellStart"/>
-      <w:r>
-        <w:t>Analisis</w:t>
-      </w:r>
-      <w:proofErr w:type="spellEnd"/>
-      <w:r>
-        <w:t xml:space="preserve"> de las preguntas del negocio en </w:t>
-      </w:r>
-      <w:proofErr w:type="spellStart"/>
-      <w:r>
-        <w:t>Jupyter</w:t>
-      </w:r>
-      <w:proofErr w:type="spellEnd"/>
-      <w:r>
-        <w:t xml:space="preserve"> Notebook</w:t>
+      <w:r>
+        <w:t>Analisis de las preguntas del negocio en Jupyter Notebook</w:t>
       </w:r>
     </w:p>
     <w:p>
@@ -4547,6 +4134,7 @@
   <w:style w:type="character" w:default="1" w:styleId="Fuentedeprrafopredeter">
     <w:name w:val="Default Paragraph Font"/>
     <w:uiPriority w:val="1"/>
+    <w:semiHidden/>
     <w:unhideWhenUsed/>
   </w:style>
   <w:style w:type="table" w:default="1" w:styleId="Tablanormal">

</xml_diff>